<commit_message>
Correctly replace methodology text and numbers in Manuscript
</commit_message>
<xml_diff>
--- a/TMIL-ETH_Manuscript_v5.docx
+++ b/TMIL-ETH_Manuscript_v5.docx
@@ -1916,13 +1916,13 @@
       </w:r>
     </w:p>
     <w:bookmarkEnd w:id="20"/>
-    <w:bookmarkStart w:id="21" w:name="triple-pooling-attention-mechanism"/>
+    <w:bookmarkStart w:id="21" w:name="gated-attention-mechanism"/>
     <w:p>
       <w:pPr>
         <w:pStyle w:val="Heading2"/>
       </w:pPr>
       <w:r>
-        <w:t xml:space="preserve">3.2 Triple Pooling Attention Mechanism</w:t>
+        <w:t xml:space="preserve">3.2 Gated Attention Mechanism</w:t>
       </w:r>
     </w:p>
     <w:p>
@@ -2155,7 +2155,267 @@
         <w:pStyle w:val="BodyText"/>
       </w:pPr>
       <w:r>
-        <w:t xml:space="preserve">Standard ABMIL utilizes a gated attention network to compute an attention weight</w:t>
+        <w:t xml:space="preserve">To strictly adhere to the mathematical foundations of permutation-invariant Multiple Instance Learning while maximizing the signal-to-noise ratio in highly imbalanced transactional data, TMIL-ETH employs a</w:t>
+      </w:r>
+      <w:r>
+        <w:t xml:space="preserve"> </w:t>
+      </w:r>
+      <w:r>
+        <w:rPr>
+          <w:b/>
+          <w:bCs/>
+        </w:rPr>
+        <w:t xml:space="preserve">Gated Attention Mechanism</w:t>
+      </w:r>
+      <w:r>
+        <w:t xml:space="preserve"> </w:t>
+      </w:r>
+      <w:r>
+        <w:t xml:space="preserve">(adapted from Ilse et al., 2018).</w:t>
+      </w:r>
+    </w:p>
+    <w:p>
+      <w:pPr>
+        <w:pStyle w:val="BodyText"/>
+      </w:pPr>
+      <w:r>
+        <w:t xml:space="preserve">In blockchain phishing, the vast majority of an account’s transactions (&gt;95%) serve as</w:t>
+      </w:r>
+      <w:r>
+        <w:t xml:space="preserve"> </w:t>
+      </w:r>
+      <w:r>
+        <w:t xml:space="preserve">“normal camouflage,”</w:t>
+      </w:r>
+      <w:r>
+        <w:t xml:space="preserve"> </w:t>
+      </w:r>
+      <w:r>
+        <w:t xml:space="preserve">while illicit asset transfers occur in extremely brief bursts. Standard attention mechanisms (using a simple</w:t>
+      </w:r>
+      <w:r>
+        <w:t xml:space="preserve"> </w:t>
+      </w:r>
+      <w:r>
+        <w:rPr>
+          <w:rStyle w:val="VerbatimChar"/>
+        </w:rPr>
+        <w:t xml:space="preserve">tanh</w:t>
+      </w:r>
+      <w:r>
+        <w:t xml:space="preserve"> </w:t>
+      </w:r>
+      <w:r>
+        <w:t xml:space="preserve">projection) struggle to completely silence this overwhelming camouflage, as</w:t>
+      </w:r>
+      <w:r>
+        <w:t xml:space="preserve"> </w:t>
+      </w:r>
+      <w:r>
+        <w:rPr>
+          <w:rStyle w:val="VerbatimChar"/>
+        </w:rPr>
+        <w:t xml:space="preserve">tanh</w:t>
+      </w:r>
+      <w:r>
+        <w:t xml:space="preserve"> </w:t>
+      </w:r>
+      <w:r>
+        <w:t xml:space="preserve">limits values to</w:t>
+      </w:r>
+      <w:r>
+        <w:t xml:space="preserve"> </w:t>
+      </w:r>
+      <m:oMath>
+        <m:r>
+          <m:rPr>
+            <m:sty m:val="p"/>
+          </m:rPr>
+          <m:t>[</m:t>
+        </m:r>
+        <m:r>
+          <m:rPr>
+            <m:sty m:val="p"/>
+          </m:rPr>
+          <m:t>−</m:t>
+        </m:r>
+        <m:r>
+          <m:t>1</m:t>
+        </m:r>
+        <m:r>
+          <m:rPr>
+            <m:sty m:val="p"/>
+          </m:rPr>
+          <m:t>,</m:t>
+        </m:r>
+        <m:r>
+          <m:t>1</m:t>
+        </m:r>
+        <m:r>
+          <m:rPr>
+            <m:sty m:val="p"/>
+          </m:rPr>
+          <m:t>]</m:t>
+        </m:r>
+      </m:oMath>
+      <w:r>
+        <w:t xml:space="preserve">. To overcome this, we introduce a non-linear sigmoid gate</w:t>
+      </w:r>
+      <w:r>
+        <w:t xml:space="preserve"> </w:t>
+      </w:r>
+      <m:oMath>
+        <m:r>
+          <m:rPr>
+            <m:nor/>
+            <m:sty m:val="p"/>
+          </m:rPr>
+          <m:t>sigm</m:t>
+        </m:r>
+        <m:r>
+          <m:rPr>
+            <m:sty m:val="p"/>
+          </m:rPr>
+          <m:t>(</m:t>
+        </m:r>
+        <m:r>
+          <m:t>U</m:t>
+        </m:r>
+        <m:sSubSup>
+          <m:e>
+            <m:r>
+              <m:t>h</m:t>
+            </m:r>
+          </m:e>
+          <m:sub>
+            <m:r>
+              <m:t>i</m:t>
+            </m:r>
+          </m:sub>
+          <m:sup>
+            <m:r>
+              <m:t>T</m:t>
+            </m:r>
+          </m:sup>
+        </m:sSubSup>
+        <m:r>
+          <m:rPr>
+            <m:sty m:val="p"/>
+          </m:rPr>
+          <m:t>)</m:t>
+        </m:r>
+      </m:oMath>
+      <w:r>
+        <w:t xml:space="preserve">, which allows the network to learn a true suppression function capable of aggressively driving the attention weights of irrelevant windows to exactly zero.</w:t>
+      </w:r>
+    </w:p>
+    <w:p>
+      <w:pPr>
+        <w:pStyle w:val="BodyText"/>
+      </w:pPr>
+      <w:r>
+        <w:t xml:space="preserve">For a bag of transactional instances</w:t>
+      </w:r>
+      <w:r>
+        <w:t xml:space="preserve"> </w:t>
+      </w:r>
+      <m:oMath>
+        <m:r>
+          <m:t>H</m:t>
+        </m:r>
+        <m:r>
+          <m:rPr>
+            <m:sty m:val="p"/>
+          </m:rPr>
+          <m:t>=</m:t>
+        </m:r>
+        <m:r>
+          <m:rPr>
+            <m:sty m:val="p"/>
+          </m:rPr>
+          <m:t>{</m:t>
+        </m:r>
+        <m:sSub>
+          <m:e>
+            <m:r>
+              <m:t>h</m:t>
+            </m:r>
+          </m:e>
+          <m:sub>
+            <m:r>
+              <m:t>1</m:t>
+            </m:r>
+          </m:sub>
+        </m:sSub>
+        <m:r>
+          <m:rPr>
+            <m:sty m:val="p"/>
+          </m:rPr>
+          <m:t>,</m:t>
+        </m:r>
+        <m:sSub>
+          <m:e>
+            <m:r>
+              <m:t>h</m:t>
+            </m:r>
+          </m:e>
+          <m:sub>
+            <m:r>
+              <m:t>2</m:t>
+            </m:r>
+          </m:sub>
+        </m:sSub>
+        <m:r>
+          <m:rPr>
+            <m:sty m:val="p"/>
+          </m:rPr>
+          <m:t>,</m:t>
+        </m:r>
+        <m:r>
+          <m:rPr>
+            <m:sty m:val="p"/>
+          </m:rPr>
+          <m:t>.</m:t>
+        </m:r>
+        <m:r>
+          <m:rPr>
+            <m:sty m:val="p"/>
+          </m:rPr>
+          <m:t>.</m:t>
+        </m:r>
+        <m:r>
+          <m:rPr>
+            <m:sty m:val="p"/>
+          </m:rPr>
+          <m:t>.</m:t>
+        </m:r>
+        <m:r>
+          <m:rPr>
+            <m:sty m:val="p"/>
+          </m:rPr>
+          <m:t>,</m:t>
+        </m:r>
+        <m:sSub>
+          <m:e>
+            <m:r>
+              <m:t>h</m:t>
+            </m:r>
+          </m:e>
+          <m:sub>
+            <m:r>
+              <m:t>N</m:t>
+            </m:r>
+          </m:sub>
+        </m:sSub>
+        <m:r>
+          <m:rPr>
+            <m:sty m:val="p"/>
+          </m:rPr>
+          <m:t>}</m:t>
+        </m:r>
+      </m:oMath>
+      <w:r>
+        <w:t xml:space="preserve">, the attention weight</w:t>
       </w:r>
       <w:r>
         <w:t xml:space="preserve"> </w:t>
@@ -2178,7 +2438,7 @@
         <w:t xml:space="preserve"> </w:t>
       </w:r>
       <w:r>
-        <w:t xml:space="preserve">for each instance:</w:t>
+        <w:t xml:space="preserve">for each instance is computed as:</w:t>
       </w:r>
     </w:p>
     <w:p>
@@ -2504,33 +2764,74 @@
         <w:pStyle w:val="FirstParagraph"/>
       </w:pPr>
       <w:r>
-        <w:t xml:space="preserve">The standard bag representation is the attention-weighted sum:</w:t>
+        <w:t xml:space="preserve">where</w:t>
       </w:r>
       <w:r>
         <w:t xml:space="preserve"> </w:t>
       </w:r>
       <m:oMath>
-        <m:sSub>
-          <m:e>
-            <m:r>
-              <m:t>z</m:t>
-            </m:r>
-          </m:e>
-          <m:sub>
-            <m:r>
-              <m:t>a</m:t>
-            </m:r>
-            <m:r>
-              <m:t>t</m:t>
-            </m:r>
-            <m:r>
-              <m:t>t</m:t>
-            </m:r>
-            <m:r>
-              <m:t>n</m:t>
-            </m:r>
-          </m:sub>
-        </m:sSub>
+        <m:r>
+          <m:t>V</m:t>
+        </m:r>
+      </m:oMath>
+      <w:r>
+        <w:t xml:space="preserve"> </w:t>
+      </w:r>
+      <w:r>
+        <w:t xml:space="preserve">and</w:t>
+      </w:r>
+      <w:r>
+        <w:t xml:space="preserve"> </w:t>
+      </w:r>
+      <m:oMath>
+        <m:r>
+          <m:t>U</m:t>
+        </m:r>
+      </m:oMath>
+      <w:r>
+        <w:t xml:space="preserve"> </w:t>
+      </w:r>
+      <w:r>
+        <w:t xml:space="preserve">are trainable parameter matrices,</w:t>
+      </w:r>
+      <w:r>
+        <w:t xml:space="preserve"> </w:t>
+      </w:r>
+      <m:oMath>
+        <m:r>
+          <m:t>w</m:t>
+        </m:r>
+      </m:oMath>
+      <w:r>
+        <w:t xml:space="preserve"> </w:t>
+      </w:r>
+      <w:r>
+        <w:t xml:space="preserve">is a trainable weight vector, and</w:t>
+      </w:r>
+      <w:r>
+        <w:t xml:space="preserve"> </w:t>
+      </w:r>
+      <m:oMath>
+        <m:r>
+          <m:rPr>
+            <m:sty m:val="p"/>
+          </m:rPr>
+          <m:t>⊙</m:t>
+        </m:r>
+      </m:oMath>
+      <w:r>
+        <w:t xml:space="preserve"> </w:t>
+      </w:r>
+      <w:r>
+        <w:t xml:space="preserve">denotes element-wise multiplication. The final pooled representation is the attention-weighted sum</w:t>
+      </w:r>
+      <w:r>
+        <w:t xml:space="preserve"> </w:t>
+      </w:r>
+      <m:oMath>
+        <m:r>
+          <m:t>Z</m:t>
+        </m:r>
         <m:r>
           <m:rPr>
             <m:sty m:val="p"/>
@@ -2592,15 +2893,106 @@
         </m:sSub>
       </m:oMath>
       <w:r>
+        <w:t xml:space="preserve">. This representation</w:t>
+      </w:r>
+      <w:r>
+        <w:t xml:space="preserve"> </w:t>
+      </w:r>
+      <m:oMath>
+        <m:r>
+          <m:t>Z</m:t>
+        </m:r>
+      </m:oMath>
+      <w:r>
+        <w:t xml:space="preserve"> </w:t>
+      </w:r>
+      <w:r>
+        <w:t xml:space="preserve">is then passed through a fully connected MLP classifier to output the final phishing probability</w:t>
+      </w:r>
+      <w:r>
+        <w:t xml:space="preserve"> </w:t>
+      </w:r>
+      <m:oMath>
+        <m:sSub>
+          <m:e>
+            <m:r>
+              <m:t>p</m:t>
+            </m:r>
+          </m:e>
+          <m:sub>
+            <m:r>
+              <m:t>a</m:t>
+            </m:r>
+            <m:r>
+              <m:t>c</m:t>
+            </m:r>
+            <m:r>
+              <m:t>c</m:t>
+            </m:r>
+            <m:r>
+              <m:t>t</m:t>
+            </m:r>
+          </m:sub>
+        </m:sSub>
+        <m:r>
+          <m:rPr>
+            <m:sty m:val="p"/>
+          </m:rPr>
+          <m:t>∈</m:t>
+        </m:r>
+        <m:r>
+          <m:rPr>
+            <m:sty m:val="p"/>
+          </m:rPr>
+          <m:t>[</m:t>
+        </m:r>
+        <m:r>
+          <m:t>0</m:t>
+        </m:r>
+        <m:r>
+          <m:rPr>
+            <m:sty m:val="p"/>
+          </m:rPr>
+          <m:t>,</m:t>
+        </m:r>
+        <m:r>
+          <m:t>1</m:t>
+        </m:r>
+        <m:r>
+          <m:rPr>
+            <m:sty m:val="p"/>
+          </m:rPr>
+          <m:t>]</m:t>
+        </m:r>
+      </m:oMath>
+      <w:r>
         <w:t xml:space="preserve">.</w:t>
       </w:r>
     </w:p>
+    <w:bookmarkEnd w:id="21"/>
+    <w:bookmarkStart w:id="22" w:name="permutation-invariant-contrastive-loss"/>
+    <w:p>
+      <w:pPr>
+        <w:pStyle w:val="Heading2"/>
+      </w:pPr>
+      <w:r>
+        <w:t xml:space="preserve">3.3 Permutation-Invariant Contrastive Loss</w:t>
+      </w:r>
+    </w:p>
+    <w:p>
+      <w:pPr>
+        <w:pStyle w:val="FirstParagraph"/>
+      </w:pPr>
+      <w:r>
+        <w:t xml:space="preserve">While the Gated Attention architecture effectively identifies phishing patterns, unconstrained attention mechanisms can suffer from instability when training on highly imbalanced sequence lengths. Previous iterations of MIL models often incorporated structural or temporal regularization (such as consistency penalties between adjacent instances). However, penalizing temporal ordering explicitly violates the fundamental MIL assumption of permutation invariance, leading to conflicting gradients and high cross-validation variance.</w:t>
+      </w:r>
+    </w:p>
     <w:p>
       <w:pPr>
         <w:pStyle w:val="BodyText"/>
       </w:pPr>
       <w:r>
-        <w:t xml:space="preserve">However, in blockchain forensics, phishing accounts exhibit both sharp anomalies (e.g., a sudden laundering burst) and long-term deceptive baseline behaviors (e.g., mimicking normal DeFi interactions). To capture this duality, we propose a</w:t>
+        <w:t xml:space="preserve">To resolve this, TMIL-ETH relies on a strictly permutation-invariant</w:t>
       </w:r>
       <w:r>
         <w:t xml:space="preserve"> </w:t>
@@ -2610,1100 +3002,10 @@
           <w:b/>
           <w:bCs/>
         </w:rPr>
-        <w:t xml:space="preserve">Triple Pooling Mechanism</w:t>
-      </w:r>
-      <w:r>
-        <w:t xml:space="preserve">:</w:t>
-      </w:r>
-    </w:p>
-    <w:p>
-      <w:pPr>
-        <w:pStyle w:val="BodyText"/>
-      </w:pPr>
-      <m:oMathPara>
-        <m:oMathParaPr>
-          <m:jc m:val="center"/>
-        </m:oMathParaPr>
-        <m:oMath>
-          <m:sSub>
-            <m:e>
-              <m:r>
-                <m:t>z</m:t>
-              </m:r>
-            </m:e>
-            <m:sub>
-              <m:r>
-                <m:t>m</m:t>
-              </m:r>
-              <m:r>
-                <m:t>e</m:t>
-              </m:r>
-              <m:r>
-                <m:t>a</m:t>
-              </m:r>
-              <m:r>
-                <m:t>n</m:t>
-              </m:r>
-            </m:sub>
-          </m:sSub>
-          <m:r>
-            <m:rPr>
-              <m:sty m:val="p"/>
-            </m:rPr>
-            <m:t>=</m:t>
-          </m:r>
-          <m:f>
-            <m:fPr>
-              <m:type m:val="bar"/>
-            </m:fPr>
-            <m:num>
-              <m:r>
-                <m:t>1</m:t>
-              </m:r>
-            </m:num>
-            <m:den>
-              <m:r>
-                <m:t>N</m:t>
-              </m:r>
-            </m:den>
-          </m:f>
-          <m:nary>
-            <m:naryPr>
-              <m:chr m:val="∑"/>
-              <m:limLoc m:val="undOvr"/>
-              <m:subHide m:val="off"/>
-              <m:supHide m:val="off"/>
-            </m:naryPr>
-            <m:sub>
-              <m:r>
-                <m:t>i</m:t>
-              </m:r>
-              <m:r>
-                <m:rPr>
-                  <m:sty m:val="p"/>
-                </m:rPr>
-                <m:t>=</m:t>
-              </m:r>
-              <m:r>
-                <m:t>1</m:t>
-              </m:r>
-            </m:sub>
-            <m:sup>
-              <m:r>
-                <m:t>N</m:t>
-              </m:r>
-            </m:sup>
-            <m:e>
-              <m:sSub>
-                <m:e>
-                  <m:r>
-                    <m:t>h</m:t>
-                  </m:r>
-                </m:e>
-                <m:sub>
-                  <m:r>
-                    <m:t>i</m:t>
-                  </m:r>
-                </m:sub>
-              </m:sSub>
-            </m:e>
-          </m:nary>
-          <m:r>
-            <m:t> </m:t>
-          </m:r>
-          <m:r>
-            <m:rPr>
-              <m:nor/>
-              <m:sty m:val="p"/>
-            </m:rPr>
-            <m:t>(captures the macroscopic behavioral baseline)</m:t>
-          </m:r>
-        </m:oMath>
-      </m:oMathPara>
-    </w:p>
-    <w:p>
-      <w:pPr>
-        <w:pStyle w:val="FirstParagraph"/>
-      </w:pPr>
-      <m:oMathPara>
-        <m:oMathParaPr>
-          <m:jc m:val="center"/>
-        </m:oMathParaPr>
-        <m:oMath>
-          <m:sSub>
-            <m:e>
-              <m:r>
-                <m:t>z</m:t>
-              </m:r>
-            </m:e>
-            <m:sub>
-              <m:r>
-                <m:t>m</m:t>
-              </m:r>
-              <m:r>
-                <m:t>a</m:t>
-              </m:r>
-              <m:r>
-                <m:t>x</m:t>
-              </m:r>
-            </m:sub>
-          </m:sSub>
-          <m:r>
-            <m:rPr>
-              <m:sty m:val="p"/>
-            </m:rPr>
-            <m:t>=</m:t>
-          </m:r>
-          <m:limLow>
-            <m:e>
-              <m:r>
-                <m:rPr>
-                  <m:sty m:val="p"/>
-                </m:rPr>
-                <m:t>max</m:t>
-              </m:r>
-            </m:e>
-            <m:lim>
-              <m:r>
-                <m:t>i</m:t>
-              </m:r>
-            </m:lim>
-          </m:limLow>
-          <m:r>
-            <m:rPr>
-              <m:sty m:val="p"/>
-            </m:rPr>
-            <m:t>(</m:t>
-          </m:r>
-          <m:sSub>
-            <m:e>
-              <m:r>
-                <m:t>h</m:t>
-              </m:r>
-            </m:e>
-            <m:sub>
-              <m:r>
-                <m:t>i</m:t>
-              </m:r>
-            </m:sub>
-          </m:sSub>
-          <m:r>
-            <m:rPr>
-              <m:sty m:val="p"/>
-            </m:rPr>
-            <m:t>)</m:t>
-          </m:r>
-          <m:r>
-            <m:t> </m:t>
-          </m:r>
-          <m:r>
-            <m:rPr>
-              <m:nor/>
-              <m:sty m:val="p"/>
-            </m:rPr>
-            <m:t>(captures the sharpest, most anomalous instance)</m:t>
-          </m:r>
-        </m:oMath>
-      </m:oMathPara>
-    </w:p>
-    <w:p>
-      <w:pPr>
-        <w:pStyle w:val="FirstParagraph"/>
-      </w:pPr>
-      <w:r>
-        <w:t xml:space="preserve">The final bag representation</w:t>
-      </w:r>
-      <w:r>
-        <w:t xml:space="preserve"> </w:t>
-      </w:r>
-      <m:oMath>
-        <m:sSub>
-          <m:e>
-            <m:r>
-              <m:t>Z</m:t>
-            </m:r>
-          </m:e>
-          <m:sub>
-            <m:r>
-              <m:t>A</m:t>
-            </m:r>
-          </m:sub>
-        </m:sSub>
-      </m:oMath>
-      <w:r>
-        <w:t xml:space="preserve"> </w:t>
-      </w:r>
-      <w:r>
-        <w:t xml:space="preserve">is the concatenation of all three pooling strategies:</w:t>
-      </w:r>
-    </w:p>
-    <w:p>
-      <w:pPr>
-        <w:pStyle w:val="BodyText"/>
-      </w:pPr>
-      <m:oMathPara>
-        <m:oMathParaPr>
-          <m:jc m:val="center"/>
-        </m:oMathParaPr>
-        <m:oMath>
-          <m:sSub>
-            <m:e>
-              <m:r>
-                <m:t>Z</m:t>
-              </m:r>
-            </m:e>
-            <m:sub>
-              <m:r>
-                <m:t>A</m:t>
-              </m:r>
-            </m:sub>
-          </m:sSub>
-          <m:r>
-            <m:rPr>
-              <m:sty m:val="p"/>
-            </m:rPr>
-            <m:t>=</m:t>
-          </m:r>
-          <m:r>
-            <m:rPr>
-              <m:sty m:val="p"/>
-            </m:rPr>
-            <m:t>[</m:t>
-          </m:r>
-          <m:sSub>
-            <m:e>
-              <m:r>
-                <m:t>z</m:t>
-              </m:r>
-            </m:e>
-            <m:sub>
-              <m:r>
-                <m:t>a</m:t>
-              </m:r>
-              <m:r>
-                <m:t>t</m:t>
-              </m:r>
-              <m:r>
-                <m:t>t</m:t>
-              </m:r>
-              <m:r>
-                <m:t>n</m:t>
-              </m:r>
-            </m:sub>
-          </m:sSub>
-          <m:r>
-            <m:rPr>
-              <m:sty m:val="p"/>
-            </m:rPr>
-            <m:t>∥</m:t>
-          </m:r>
-          <m:sSub>
-            <m:e>
-              <m:r>
-                <m:t>z</m:t>
-              </m:r>
-            </m:e>
-            <m:sub>
-              <m:r>
-                <m:t>m</m:t>
-              </m:r>
-              <m:r>
-                <m:t>e</m:t>
-              </m:r>
-              <m:r>
-                <m:t>a</m:t>
-              </m:r>
-              <m:r>
-                <m:t>n</m:t>
-              </m:r>
-            </m:sub>
-          </m:sSub>
-          <m:r>
-            <m:rPr>
-              <m:sty m:val="p"/>
-            </m:rPr>
-            <m:t>∥</m:t>
-          </m:r>
-          <m:sSub>
-            <m:e>
-              <m:r>
-                <m:t>z</m:t>
-              </m:r>
-            </m:e>
-            <m:sub>
-              <m:r>
-                <m:t>m</m:t>
-              </m:r>
-              <m:r>
-                <m:t>a</m:t>
-              </m:r>
-              <m:r>
-                <m:t>x</m:t>
-              </m:r>
-            </m:sub>
-          </m:sSub>
-          <m:r>
-            <m:rPr>
-              <m:sty m:val="p"/>
-            </m:rPr>
-            <m:t>]</m:t>
-          </m:r>
-          <m:r>
-            <m:rPr>
-              <m:sty m:val="p"/>
-            </m:rPr>
-            <m:t>∈</m:t>
-          </m:r>
-          <m:sSup>
-            <m:e>
-              <m:r>
-                <m:rPr>
-                  <m:scr m:val="double-struck"/>
-                  <m:sty m:val="p"/>
-                </m:rPr>
-                <m:t>R</m:t>
-              </m:r>
-            </m:e>
-            <m:sup>
-              <m:r>
-                <m:t>192</m:t>
-              </m:r>
-            </m:sup>
-          </m:sSup>
-        </m:oMath>
-      </m:oMathPara>
-    </w:p>
-    <w:p>
-      <w:pPr>
-        <w:pStyle w:val="FirstParagraph"/>
-      </w:pPr>
-      <m:oMath>
-        <m:sSub>
-          <m:e>
-            <m:r>
-              <m:t>Z</m:t>
-            </m:r>
-          </m:e>
-          <m:sub>
-            <m:r>
-              <m:t>A</m:t>
-            </m:r>
-          </m:sub>
-        </m:sSub>
-      </m:oMath>
-      <w:r>
-        <w:t xml:space="preserve"> </w:t>
-      </w:r>
-      <w:r>
-        <w:t xml:space="preserve">is passed through a classifier</w:t>
-      </w:r>
-      <w:r>
-        <w:t xml:space="preserve"> </w:t>
-      </w:r>
-      <m:oMath>
-        <m:sSub>
-          <m:e>
-            <m:r>
-              <m:t>C</m:t>
-            </m:r>
-          </m:e>
-          <m:sub>
-            <m:r>
-              <m:t>ϕ</m:t>
-            </m:r>
-          </m:sub>
-        </m:sSub>
-      </m:oMath>
-      <w:r>
-        <w:t xml:space="preserve"> </w:t>
-      </w:r>
-      <w:r>
-        <w:t xml:space="preserve">to output the bag-level phishing probability</w:t>
-      </w:r>
-      <w:r>
-        <w:t xml:space="preserve"> </w:t>
-      </w:r>
-      <m:oMath>
-        <m:sSub>
-          <m:e>
-            <m:r>
-              <m:t>p</m:t>
-            </m:r>
-          </m:e>
-          <m:sub>
-            <m:r>
-              <m:t>A</m:t>
-            </m:r>
-          </m:sub>
-        </m:sSub>
-      </m:oMath>
-      <w:r>
-        <w:t xml:space="preserve">.</w:t>
-      </w:r>
-    </w:p>
-    <w:bookmarkEnd w:id="21"/>
-    <w:bookmarkStart w:id="22" w:name="phish-masked-compound-loss"/>
-    <w:p>
-      <w:pPr>
-        <w:pStyle w:val="Heading2"/>
-      </w:pPr>
-      <w:r>
-        <w:t xml:space="preserve">3.3 Phish-Masked Compound Loss</w:t>
-      </w:r>
-    </w:p>
-    <w:p>
-      <w:pPr>
-        <w:pStyle w:val="FirstParagraph"/>
-      </w:pPr>
-      <w:r>
-        <w:t xml:space="preserve">A known failure mode of MIL is attention collapse, where the model distributes attention uniformly or focuses on spurious correlations. To enforce temporal continuity and sharp discrimination, we introduce a Compound Loss.</w:t>
-      </w:r>
-    </w:p>
-    <w:p>
-      <w:pPr>
-        <w:pStyle w:val="BodyText"/>
-      </w:pPr>
-      <w:r>
-        <w:t xml:space="preserve">Let</w:t>
-      </w:r>
-      <w:r>
-        <w:t xml:space="preserve"> </w:t>
-      </w:r>
-      <m:oMath>
-        <m:sSub>
-          <m:e>
-            <m:r>
-              <m:t>H</m:t>
-            </m:r>
-          </m:e>
-          <m:sub>
-            <m:r>
-              <m:t>b</m:t>
-            </m:r>
-            <m:r>
-              <m:t>a</m:t>
-            </m:r>
-            <m:r>
-              <m:t>g</m:t>
-            </m:r>
-          </m:sub>
-        </m:sSub>
-        <m:r>
-          <m:rPr>
-            <m:sty m:val="p"/>
-          </m:rPr>
-          <m:t>=</m:t>
-        </m:r>
-        <m:r>
-          <m:rPr>
-            <m:sty m:val="p"/>
-          </m:rPr>
-          <m:t>{</m:t>
-        </m:r>
-        <m:sSub>
-          <m:e>
-            <m:r>
-              <m:t>h</m:t>
-            </m:r>
-          </m:e>
-          <m:sub>
-            <m:r>
-              <m:t>1</m:t>
-            </m:r>
-          </m:sub>
-        </m:sSub>
-        <m:r>
-          <m:rPr>
-            <m:sty m:val="p"/>
-          </m:rPr>
-          <m:t>,</m:t>
-        </m:r>
-        <m:r>
-          <m:rPr>
-            <m:sty m:val="p"/>
-          </m:rPr>
-          <m:t>.</m:t>
-        </m:r>
-        <m:r>
-          <m:rPr>
-            <m:sty m:val="p"/>
-          </m:rPr>
-          <m:t>.</m:t>
-        </m:r>
-        <m:r>
-          <m:rPr>
-            <m:sty m:val="p"/>
-          </m:rPr>
-          <m:t>.</m:t>
-        </m:r>
-        <m:r>
-          <m:rPr>
-            <m:sty m:val="p"/>
-          </m:rPr>
-          <m:t>,</m:t>
-        </m:r>
-        <m:sSub>
-          <m:e>
-            <m:r>
-              <m:t>h</m:t>
-            </m:r>
-          </m:e>
-          <m:sub>
-            <m:r>
-              <m:t>N</m:t>
-            </m:r>
-          </m:sub>
-        </m:sSub>
-        <m:r>
-          <m:rPr>
-            <m:sty m:val="p"/>
-          </m:rPr>
-          <m:t>}</m:t>
-        </m:r>
-      </m:oMath>
-      <w:r>
-        <w:t xml:space="preserve"> </w:t>
-      </w:r>
-      <w:r>
-        <w:t xml:space="preserve">be the instance representations. We define:</w:t>
-      </w:r>
-      <w:r>
-        <w:t xml:space="preserve"> </w:t>
-      </w:r>
-      <w:r>
-        <w:t xml:space="preserve">-</w:t>
-      </w:r>
-      <w:r>
-        <w:t xml:space="preserve"> </w:t>
-      </w:r>
-      <w:r>
-        <w:rPr>
-          <w:b/>
-          <w:bCs/>
-        </w:rPr>
-        <w:t xml:space="preserve">Consistency Loss (</w:t>
-      </w:r>
-      <m:oMath>
-        <m:sSub>
-          <m:e>
-            <m:r>
-              <m:t>L</m:t>
-            </m:r>
-          </m:e>
-          <m:sub>
-            <m:r>
-              <m:t>c</m:t>
-            </m:r>
-            <m:r>
-              <m:t>o</m:t>
-            </m:r>
-            <m:r>
-              <m:t>n</m:t>
-            </m:r>
-            <m:r>
-              <m:t>s</m:t>
-            </m:r>
-          </m:sub>
-        </m:sSub>
-      </m:oMath>
-      <w:r>
-        <w:rPr>
-          <w:b/>
-          <w:bCs/>
-        </w:rPr>
-        <w:t xml:space="preserve">):</w:t>
-      </w:r>
-      <w:r>
-        <w:t xml:space="preserve"> </w:t>
-      </w:r>
-      <w:r>
-        <w:t xml:space="preserve">Penalizes high variance among sequential instances to promote temporal smoothness.</w:t>
-      </w:r>
-      <w:r>
-        <w:t xml:space="preserve"> </w:t>
-      </w:r>
-      <m:oMath>
-        <m:sSub>
-          <m:e>
-            <m:r>
-              <m:t>L</m:t>
-            </m:r>
-          </m:e>
-          <m:sub>
-            <m:r>
-              <m:t>c</m:t>
-            </m:r>
-            <m:r>
-              <m:t>o</m:t>
-            </m:r>
-            <m:r>
-              <m:t>n</m:t>
-            </m:r>
-            <m:r>
-              <m:t>s</m:t>
-            </m:r>
-          </m:sub>
-        </m:sSub>
-        <m:r>
-          <m:rPr>
-            <m:sty m:val="p"/>
-          </m:rPr>
-          <m:t>=</m:t>
-        </m:r>
-        <m:f>
-          <m:fPr>
-            <m:type m:val="bar"/>
-          </m:fPr>
-          <m:num>
-            <m:r>
-              <m:t>1</m:t>
-            </m:r>
-          </m:num>
-          <m:den>
-            <m:r>
-              <m:t>N</m:t>
-            </m:r>
-            <m:r>
-              <m:rPr>
-                <m:sty m:val="p"/>
-              </m:rPr>
-              <m:t>−</m:t>
-            </m:r>
-            <m:r>
-              <m:t>1</m:t>
-            </m:r>
-          </m:den>
-        </m:f>
-        <m:nary>
-          <m:naryPr>
-            <m:chr m:val="∑"/>
-            <m:limLoc m:val="undOvr"/>
-            <m:subHide m:val="off"/>
-            <m:supHide m:val="off"/>
-          </m:naryPr>
-          <m:sub>
-            <m:r>
-              <m:t>i</m:t>
-            </m:r>
-            <m:r>
-              <m:rPr>
-                <m:sty m:val="p"/>
-              </m:rPr>
-              <m:t>=</m:t>
-            </m:r>
-            <m:r>
-              <m:t>1</m:t>
-            </m:r>
-          </m:sub>
-          <m:sup>
-            <m:r>
-              <m:t>N</m:t>
-            </m:r>
-            <m:r>
-              <m:rPr>
-                <m:sty m:val="p"/>
-              </m:rPr>
-              <m:t>−</m:t>
-            </m:r>
-            <m:r>
-              <m:t>1</m:t>
-            </m:r>
-          </m:sup>
-          <m:e>
-            <m:r>
-              <m:rPr>
-                <m:sty m:val="p"/>
-              </m:rPr>
-              <m:t>|</m:t>
-            </m:r>
-          </m:e>
-        </m:nary>
-        <m:r>
-          <m:rPr>
-            <m:sty m:val="p"/>
-          </m:rPr>
-          <m:t>|</m:t>
-        </m:r>
-        <m:sSub>
-          <m:e>
-            <m:r>
-              <m:t>h</m:t>
-            </m:r>
-          </m:e>
-          <m:sub>
-            <m:r>
-              <m:t>i</m:t>
-            </m:r>
-            <m:r>
-              <m:rPr>
-                <m:sty m:val="p"/>
-              </m:rPr>
-              <m:t>+</m:t>
-            </m:r>
-            <m:r>
-              <m:t>1</m:t>
-            </m:r>
-          </m:sub>
-        </m:sSub>
-        <m:r>
-          <m:rPr>
-            <m:sty m:val="p"/>
-          </m:rPr>
-          <m:t>−</m:t>
-        </m:r>
-        <m:sSub>
-          <m:e>
-            <m:r>
-              <m:t>h</m:t>
-            </m:r>
-          </m:e>
-          <m:sub>
-            <m:r>
-              <m:t>i</m:t>
-            </m:r>
-          </m:sub>
-        </m:sSub>
-        <m:r>
-          <m:rPr>
-            <m:sty m:val="p"/>
-          </m:rPr>
-          <m:t>|</m:t>
-        </m:r>
-        <m:sSubSup>
-          <m:e>
-            <m:r>
-              <m:rPr>
-                <m:sty m:val="p"/>
-              </m:rPr>
-              <m:t>|</m:t>
-            </m:r>
-          </m:e>
-          <m:sub>
-            <m:r>
-              <m:t>2</m:t>
-            </m:r>
-          </m:sub>
-          <m:sup>
-            <m:r>
-              <m:t>2</m:t>
-            </m:r>
-          </m:sup>
-        </m:sSubSup>
-      </m:oMath>
-      <w:r>
-        <w:t xml:space="preserve"> </w:t>
-      </w:r>
-      <w:r>
-        <w:t xml:space="preserve">-</w:t>
-      </w:r>
-      <w:r>
-        <w:t xml:space="preserve"> </w:t>
-      </w:r>
-      <w:r>
-        <w:rPr>
-          <w:b/>
-          <w:bCs/>
-        </w:rPr>
-        <w:t xml:space="preserve">Contrastive Loss (</w:t>
-      </w:r>
-      <m:oMath>
-        <m:sSub>
-          <m:e>
-            <m:r>
-              <m:t>L</m:t>
-            </m:r>
-          </m:e>
-          <m:sub>
-            <m:r>
-              <m:t>c</m:t>
-            </m:r>
-            <m:r>
-              <m:t>o</m:t>
-            </m:r>
-            <m:r>
-              <m:t>n</m:t>
-            </m:r>
-            <m:r>
-              <m:t>t</m:t>
-            </m:r>
-          </m:sub>
-        </m:sSub>
-      </m:oMath>
-      <w:r>
-        <w:rPr>
-          <w:b/>
-          <w:bCs/>
-        </w:rPr>
-        <w:t xml:space="preserve">):</w:t>
-      </w:r>
-      <w:r>
-        <w:t xml:space="preserve"> </w:t>
-      </w:r>
-      <w:r>
-        <w:t xml:space="preserve">Encourages the model to push the representations of the most and least attended instances apart.</w:t>
-      </w:r>
-      <w:r>
-        <w:t xml:space="preserve"> </w:t>
-      </w:r>
-      <m:oMath>
-        <m:sSub>
-          <m:e>
-            <m:r>
-              <m:t>L</m:t>
-            </m:r>
-          </m:e>
-          <m:sub>
-            <m:r>
-              <m:t>c</m:t>
-            </m:r>
-            <m:r>
-              <m:t>o</m:t>
-            </m:r>
-            <m:r>
-              <m:t>n</m:t>
-            </m:r>
-            <m:r>
-              <m:t>t</m:t>
-            </m:r>
-          </m:sub>
-        </m:sSub>
-        <m:r>
-          <m:rPr>
-            <m:sty m:val="p"/>
-          </m:rPr>
-          <m:t>=</m:t>
-        </m:r>
-        <m:r>
-          <m:rPr>
-            <m:sty m:val="p"/>
-          </m:rPr>
-          <m:t>max</m:t>
-        </m:r>
-        <m:r>
-          <m:rPr>
-            <m:sty m:val="p"/>
-          </m:rPr>
-          <m:t>(</m:t>
-        </m:r>
-        <m:r>
-          <m:t>0</m:t>
-        </m:r>
-        <m:r>
-          <m:rPr>
-            <m:sty m:val="p"/>
-          </m:rPr>
-          <m:t>,</m:t>
-        </m:r>
-        <m:r>
-          <m:t>m</m:t>
-        </m:r>
-        <m:r>
-          <m:rPr>
-            <m:sty m:val="p"/>
-          </m:rPr>
-          <m:t>−</m:t>
-        </m:r>
-        <m:r>
-          <m:rPr>
-            <m:sty m:val="p"/>
-          </m:rPr>
-          <m:t>|</m:t>
-        </m:r>
-        <m:r>
-          <m:rPr>
-            <m:sty m:val="p"/>
-          </m:rPr>
-          <m:t>|</m:t>
-        </m:r>
-        <m:sSub>
-          <m:e>
-            <m:r>
-              <m:t>h</m:t>
-            </m:r>
-          </m:e>
-          <m:sub>
-            <m:r>
-              <m:t>a</m:t>
-            </m:r>
-            <m:r>
-              <m:t>r</m:t>
-            </m:r>
-            <m:r>
-              <m:t>g</m:t>
-            </m:r>
-            <m:r>
-              <m:t>m</m:t>
-            </m:r>
-            <m:r>
-              <m:t>a</m:t>
-            </m:r>
-            <m:r>
-              <m:t>x</m:t>
-            </m:r>
-            <m:r>
-              <m:rPr>
-                <m:sty m:val="p"/>
-              </m:rPr>
-              <m:t>(</m:t>
-            </m:r>
-            <m:r>
-              <m:t>a</m:t>
-            </m:r>
-            <m:r>
-              <m:rPr>
-                <m:sty m:val="p"/>
-              </m:rPr>
-              <m:t>)</m:t>
-            </m:r>
-          </m:sub>
-        </m:sSub>
-        <m:r>
-          <m:rPr>
-            <m:sty m:val="p"/>
-          </m:rPr>
-          <m:t>−</m:t>
-        </m:r>
-        <m:sSub>
-          <m:e>
-            <m:r>
-              <m:t>h</m:t>
-            </m:r>
-          </m:e>
-          <m:sub>
-            <m:r>
-              <m:t>a</m:t>
-            </m:r>
-            <m:r>
-              <m:t>r</m:t>
-            </m:r>
-            <m:r>
-              <m:t>g</m:t>
-            </m:r>
-            <m:r>
-              <m:t>m</m:t>
-            </m:r>
-            <m:r>
-              <m:t>i</m:t>
-            </m:r>
-            <m:r>
-              <m:t>n</m:t>
-            </m:r>
-            <m:r>
-              <m:rPr>
-                <m:sty m:val="p"/>
-              </m:rPr>
-              <m:t>(</m:t>
-            </m:r>
-            <m:r>
-              <m:t>a</m:t>
-            </m:r>
-            <m:r>
-              <m:rPr>
-                <m:sty m:val="p"/>
-              </m:rPr>
-              <m:t>)</m:t>
-            </m:r>
-          </m:sub>
-        </m:sSub>
-        <m:r>
-          <m:rPr>
-            <m:sty m:val="p"/>
-          </m:rPr>
-          <m:t>|</m:t>
-        </m:r>
-        <m:sSub>
-          <m:e>
-            <m:r>
-              <m:rPr>
-                <m:sty m:val="p"/>
-              </m:rPr>
-              <m:t>|</m:t>
-            </m:r>
-          </m:e>
-          <m:sub>
-            <m:r>
-              <m:t>2</m:t>
-            </m:r>
-          </m:sub>
-        </m:sSub>
-        <m:r>
-          <m:rPr>
-            <m:sty m:val="p"/>
-          </m:rPr>
-          <m:t>)</m:t>
-        </m:r>
-      </m:oMath>
-    </w:p>
-    <w:p>
-      <w:pPr>
-        <w:pStyle w:val="BodyText"/>
-      </w:pPr>
-      <w:r>
-        <w:t xml:space="preserve">Crucially, normal accounts (Negative Bags) do not contain phishing instances; thus, forcing contrastive separation on a normal account destabilizes the latent space. We introduce a</w:t>
-      </w:r>
-      <w:r>
-        <w:t xml:space="preserve"> </w:t>
-      </w:r>
-      <w:r>
-        <w:rPr>
-          <w:b/>
-          <w:bCs/>
-        </w:rPr>
-        <w:t xml:space="preserve">Phish-Mask</w:t>
-      </w:r>
-      <w:r>
-        <w:t xml:space="preserve"> </w:t>
-      </w:r>
-      <w:r>
-        <w:t xml:space="preserve">indicator function</w:t>
-      </w:r>
-      <w:r>
-        <w:t xml:space="preserve"> </w:t>
-      </w:r>
-      <m:oMath>
-        <m:r>
-          <m:rPr>
-            <m:scr m:val="double-struck"/>
-            <m:sty m:val="p"/>
-          </m:rPr>
-          <m:t>I</m:t>
-        </m:r>
-        <m:r>
-          <m:rPr>
-            <m:sty m:val="p"/>
-          </m:rPr>
-          <m:t>(</m:t>
-        </m:r>
-        <m:sSub>
-          <m:e>
-            <m:r>
-              <m:t>y</m:t>
-            </m:r>
-          </m:e>
-          <m:sub>
-            <m:r>
-              <m:t>A</m:t>
-            </m:r>
-          </m:sub>
-        </m:sSub>
-        <m:r>
-          <m:rPr>
-            <m:sty m:val="p"/>
-          </m:rPr>
-          <m:t>=</m:t>
-        </m:r>
-        <m:r>
-          <m:t>1</m:t>
-        </m:r>
-        <m:r>
-          <m:rPr>
-            <m:sty m:val="p"/>
-          </m:rPr>
-          <m:t>)</m:t>
-        </m:r>
-      </m:oMath>
-      <w:r>
-        <w:t xml:space="preserve">:</w:t>
+        <w:t xml:space="preserve">Phish-Masked Contrastive Loss</w:t>
+      </w:r>
+      <w:r>
+        <w:t xml:space="preserve">. The total loss is defined as:</w:t>
       </w:r>
     </w:p>
     <w:p>
@@ -3769,18 +3071,9 @@
             </m:rPr>
             <m:t>(</m:t>
           </m:r>
-          <m:sSub>
-            <m:e>
-              <m:r>
-                <m:t>p</m:t>
-              </m:r>
-            </m:e>
-            <m:sub>
-              <m:r>
-                <m:t>A</m:t>
-              </m:r>
-            </m:sub>
-          </m:sSub>
+          <m:r>
+            <m:t>p</m:t>
+          </m:r>
           <m:r>
             <m:rPr>
               <m:sty m:val="p"/>
@@ -3851,146 +3144,378 @@
             </m:rPr>
             <m:t>)</m:t>
           </m:r>
-          <m:d>
-            <m:dPr>
-              <m:begChr m:val="("/>
-              <m:sepChr m:val=""/>
-              <m:endChr m:val=")"/>
-              <m:grow/>
-            </m:dPr>
+          <m:r>
+            <m:rPr>
+              <m:sty m:val="p"/>
+            </m:rPr>
+            <m:t>⋅</m:t>
+          </m:r>
+          <m:r>
+            <m:t>λ</m:t>
+          </m:r>
+          <m:sSub>
             <m:e>
-              <m:sSub>
-                <m:e>
-                  <m:r>
-                    <m:t>λ</m:t>
-                  </m:r>
-                </m:e>
-                <m:sub>
-                  <m:r>
-                    <m:t>1</m:t>
-                  </m:r>
-                </m:sub>
-              </m:sSub>
-              <m:sSub>
-                <m:e>
-                  <m:r>
-                    <m:t>L</m:t>
-                  </m:r>
-                </m:e>
-                <m:sub>
-                  <m:r>
-                    <m:t>c</m:t>
-                  </m:r>
-                  <m:r>
-                    <m:t>o</m:t>
-                  </m:r>
-                  <m:r>
-                    <m:t>n</m:t>
-                  </m:r>
-                  <m:r>
-                    <m:t>s</m:t>
-                  </m:r>
-                </m:sub>
-              </m:sSub>
-              <m:r>
-                <m:rPr>
-                  <m:sty m:val="p"/>
-                </m:rPr>
-                <m:t>+</m:t>
-              </m:r>
-              <m:sSub>
-                <m:e>
-                  <m:r>
-                    <m:t>λ</m:t>
-                  </m:r>
-                </m:e>
-                <m:sub>
-                  <m:r>
-                    <m:t>2</m:t>
-                  </m:r>
-                </m:sub>
-              </m:sSub>
-              <m:sSub>
-                <m:e>
-                  <m:r>
-                    <m:t>L</m:t>
-                  </m:r>
-                </m:e>
-                <m:sub>
-                  <m:r>
-                    <m:t>c</m:t>
-                  </m:r>
-                  <m:r>
-                    <m:t>o</m:t>
-                  </m:r>
-                  <m:r>
-                    <m:t>n</m:t>
-                  </m:r>
-                  <m:r>
-                    <m:t>t</m:t>
-                  </m:r>
-                </m:sub>
-              </m:sSub>
+              <m:r>
+                <m:t>L</m:t>
+              </m:r>
             </m:e>
-          </m:d>
+            <m:sub>
+              <m:r>
+                <m:t>c</m:t>
+              </m:r>
+              <m:r>
+                <m:t>o</m:t>
+              </m:r>
+              <m:r>
+                <m:t>n</m:t>
+              </m:r>
+              <m:r>
+                <m:t>t</m:t>
+              </m:r>
+              <m:r>
+                <m:t>r</m:t>
+              </m:r>
+              <m:r>
+                <m:t>a</m:t>
+              </m:r>
+              <m:r>
+                <m:t>s</m:t>
+              </m:r>
+              <m:r>
+                <m:t>t</m:t>
+              </m:r>
+            </m:sub>
+          </m:sSub>
         </m:oMath>
       </m:oMathPara>
     </w:p>
     <w:p>
       <w:pPr>
-        <w:pStyle w:val="FirstParagraph"/>
-      </w:pPr>
-      <w:r>
-        <w:t xml:space="preserve">Based on empirical tuning, we set</w:t>
-      </w:r>
-      <w:r>
-        <w:t xml:space="preserve"> </w:t>
+        <w:pStyle w:val="Compact"/>
+        <w:numPr>
+          <w:ilvl w:val="0"/>
+          <w:numId w:val="1001"/>
+        </w:numPr>
+      </w:pPr>
+      <w:r>
+        <w:rPr>
+          <w:b/>
+          <w:bCs/>
+        </w:rPr>
+        <w:t xml:space="preserve">Binary Cross-Entropy (</w:t>
       </w:r>
       <m:oMath>
         <m:sSub>
           <m:e>
             <m:r>
-              <m:t>λ</m:t>
+              <m:t>L</m:t>
             </m:r>
           </m:e>
           <m:sub>
             <m:r>
-              <m:t>1</m:t>
+              <m:t>B</m:t>
+            </m:r>
+            <m:r>
+              <m:t>C</m:t>
+            </m:r>
+            <m:r>
+              <m:t>E</m:t>
             </m:r>
           </m:sub>
         </m:sSub>
-        <m:r>
-          <m:rPr>
-            <m:sty m:val="p"/>
-          </m:rPr>
-          <m:t>=</m:t>
-        </m:r>
-        <m:r>
-          <m:t>0.3</m:t>
-        </m:r>
       </m:oMath>
       <w:r>
-        <w:t xml:space="preserve"> </w:t>
-      </w:r>
-      <w:r>
-        <w:t xml:space="preserve">and</w:t>
-      </w:r>
-      <w:r>
-        <w:t xml:space="preserve"> </w:t>
+        <w:rPr>
+          <w:b/>
+          <w:bCs/>
+        </w:rPr>
+        <w:t xml:space="preserve">)</w:t>
+      </w:r>
+      <w:r>
+        <w:t xml:space="preserve">: Standard classification loss for the final predictions.</w:t>
+      </w:r>
+    </w:p>
+    <w:p>
+      <w:pPr>
+        <w:pStyle w:val="Compact"/>
+        <w:numPr>
+          <w:ilvl w:val="0"/>
+          <w:numId w:val="1001"/>
+        </w:numPr>
+      </w:pPr>
+      <w:r>
+        <w:rPr>
+          <w:b/>
+          <w:bCs/>
+        </w:rPr>
+        <w:t xml:space="preserve">Contrastive Loss (</w:t>
       </w:r>
       <m:oMath>
         <m:sSub>
           <m:e>
             <m:r>
-              <m:t>λ</m:t>
+              <m:t>L</m:t>
             </m:r>
           </m:e>
           <m:sub>
             <m:r>
-              <m:t>2</m:t>
+              <m:t>c</m:t>
+            </m:r>
+            <m:r>
+              <m:t>o</m:t>
+            </m:r>
+            <m:r>
+              <m:t>n</m:t>
+            </m:r>
+            <m:r>
+              <m:t>t</m:t>
+            </m:r>
+            <m:r>
+              <m:t>r</m:t>
+            </m:r>
+            <m:r>
+              <m:t>a</m:t>
+            </m:r>
+            <m:r>
+              <m:t>s</m:t>
+            </m:r>
+            <m:r>
+              <m:t>t</m:t>
             </m:r>
           </m:sub>
         </m:sSub>
+      </m:oMath>
+      <w:r>
+        <w:rPr>
+          <w:b/>
+          <w:bCs/>
+        </w:rPr>
+        <w:t xml:space="preserve">)</w:t>
+      </w:r>
+      <w:r>
+        <w:t xml:space="preserve">: A hinge loss that explicitly enforces a margin</w:t>
+      </w:r>
+      <w:r>
+        <w:t xml:space="preserve"> </w:t>
+      </w:r>
+      <m:oMath>
+        <m:r>
+          <m:t>m</m:t>
+        </m:r>
+      </m:oMath>
+      <w:r>
+        <w:t xml:space="preserve"> </w:t>
+      </w:r>
+      <w:r>
+        <w:t xml:space="preserve">between the average attention-weighted score of phishing accounts and normal accounts, preventing the attention mechanism from collapsing or highlighting normal camouflage.</w:t>
+      </w:r>
+    </w:p>
+    <w:p>
+      <w:pPr>
+        <w:pStyle w:val="Compact"/>
+      </w:pPr>
+      <m:oMathPara>
+        <m:oMathParaPr>
+          <m:jc m:val="center"/>
+        </m:oMathParaPr>
+        <m:oMath>
+          <m:sSub>
+            <m:e>
+              <m:r>
+                <m:t>L</m:t>
+              </m:r>
+            </m:e>
+            <m:sub>
+              <m:r>
+                <m:t>c</m:t>
+              </m:r>
+              <m:r>
+                <m:t>o</m:t>
+              </m:r>
+              <m:r>
+                <m:t>n</m:t>
+              </m:r>
+              <m:r>
+                <m:t>t</m:t>
+              </m:r>
+              <m:r>
+                <m:t>r</m:t>
+              </m:r>
+              <m:r>
+                <m:t>a</m:t>
+              </m:r>
+              <m:r>
+                <m:t>s</m:t>
+              </m:r>
+              <m:r>
+                <m:t>t</m:t>
+              </m:r>
+            </m:sub>
+          </m:sSub>
+          <m:r>
+            <m:rPr>
+              <m:sty m:val="p"/>
+            </m:rPr>
+            <m:t>=</m:t>
+          </m:r>
+          <m:r>
+            <m:rPr>
+              <m:sty m:val="p"/>
+            </m:rPr>
+            <m:t>max</m:t>
+          </m:r>
+          <m:r>
+            <m:rPr>
+              <m:sty m:val="p"/>
+            </m:rPr>
+            <m:t>(</m:t>
+          </m:r>
+          <m:r>
+            <m:t>0</m:t>
+          </m:r>
+          <m:r>
+            <m:rPr>
+              <m:sty m:val="p"/>
+            </m:rPr>
+            <m:t>,</m:t>
+          </m:r>
+          <m:r>
+            <m:t>m</m:t>
+          </m:r>
+          <m:r>
+            <m:rPr>
+              <m:sty m:val="p"/>
+            </m:rPr>
+            <m:t>−</m:t>
+          </m:r>
+          <m:r>
+            <m:rPr>
+              <m:sty m:val="p"/>
+            </m:rPr>
+            <m:t>(</m:t>
+          </m:r>
+          <m:sSub>
+            <m:e>
+              <m:acc>
+                <m:accPr>
+                  <m:chr m:val="‾"/>
+                </m:accPr>
+                <m:e>
+                  <m:r>
+                    <m:t>p</m:t>
+                  </m:r>
+                </m:e>
+              </m:acc>
+            </m:e>
+            <m:sub>
+              <m:r>
+                <m:t>p</m:t>
+              </m:r>
+              <m:r>
+                <m:t>h</m:t>
+              </m:r>
+              <m:r>
+                <m:t>i</m:t>
+              </m:r>
+              <m:r>
+                <m:t>s</m:t>
+              </m:r>
+              <m:r>
+                <m:t>h</m:t>
+              </m:r>
+            </m:sub>
+          </m:sSub>
+          <m:r>
+            <m:rPr>
+              <m:sty m:val="p"/>
+            </m:rPr>
+            <m:t>−</m:t>
+          </m:r>
+          <m:sSub>
+            <m:e>
+              <m:acc>
+                <m:accPr>
+                  <m:chr m:val="‾"/>
+                </m:accPr>
+                <m:e>
+                  <m:r>
+                    <m:t>p</m:t>
+                  </m:r>
+                </m:e>
+              </m:acc>
+            </m:e>
+            <m:sub>
+              <m:r>
+                <m:t>n</m:t>
+              </m:r>
+              <m:r>
+                <m:t>o</m:t>
+              </m:r>
+              <m:r>
+                <m:t>r</m:t>
+              </m:r>
+              <m:r>
+                <m:t>m</m:t>
+              </m:r>
+              <m:r>
+                <m:t>a</m:t>
+              </m:r>
+              <m:r>
+                <m:t>l</m:t>
+              </m:r>
+            </m:sub>
+          </m:sSub>
+          <m:r>
+            <m:rPr>
+              <m:sty m:val="p"/>
+            </m:rPr>
+            <m:t>)</m:t>
+          </m:r>
+          <m:r>
+            <m:rPr>
+              <m:sty m:val="p"/>
+            </m:rPr>
+            <m:t>)</m:t>
+          </m:r>
+        </m:oMath>
+      </m:oMathPara>
+    </w:p>
+    <w:p>
+      <w:pPr>
+        <w:pStyle w:val="FirstParagraph"/>
+      </w:pPr>
+      <w:r>
+        <w:t xml:space="preserve">Crucially, the indicator function</w:t>
+      </w:r>
+      <w:r>
+        <w:t xml:space="preserve"> </w:t>
+      </w:r>
+      <m:oMath>
+        <m:r>
+          <m:rPr>
+            <m:scr m:val="double-struck"/>
+            <m:sty m:val="p"/>
+          </m:rPr>
+          <m:t>I</m:t>
+        </m:r>
+        <m:r>
+          <m:rPr>
+            <m:sty m:val="p"/>
+          </m:rPr>
+          <m:t>(</m:t>
+        </m:r>
+        <m:sSub>
+          <m:e>
+            <m:r>
+              <m:t>y</m:t>
+            </m:r>
+          </m:e>
+          <m:sub>
+            <m:r>
+              <m:t>A</m:t>
+            </m:r>
+          </m:sub>
+        </m:sSub>
         <m:r>
           <m:rPr>
             <m:sty m:val="p"/>
@@ -3998,11 +3523,80 @@
           <m:t>=</m:t>
         </m:r>
         <m:r>
-          <m:t>0.2</m:t>
+          <m:t>1</m:t>
+        </m:r>
+        <m:r>
+          <m:rPr>
+            <m:sty m:val="p"/>
+          </m:rPr>
+          <m:t>)</m:t>
         </m:r>
       </m:oMath>
       <w:r>
-        <w:t xml:space="preserve">.</w:t>
+        <w:t xml:space="preserve"> </w:t>
+      </w:r>
+      <w:r>
+        <w:t xml:space="preserve">ensures that</w:t>
+      </w:r>
+      <w:r>
+        <w:t xml:space="preserve"> </w:t>
+      </w:r>
+      <m:oMath>
+        <m:sSub>
+          <m:e>
+            <m:r>
+              <m:t>L</m:t>
+            </m:r>
+          </m:e>
+          <m:sub>
+            <m:r>
+              <m:t>c</m:t>
+            </m:r>
+            <m:r>
+              <m:t>o</m:t>
+            </m:r>
+            <m:r>
+              <m:t>n</m:t>
+            </m:r>
+            <m:r>
+              <m:t>t</m:t>
+            </m:r>
+            <m:r>
+              <m:t>r</m:t>
+            </m:r>
+            <m:r>
+              <m:t>a</m:t>
+            </m:r>
+            <m:r>
+              <m:t>s</m:t>
+            </m:r>
+            <m:r>
+              <m:t>t</m:t>
+            </m:r>
+          </m:sub>
+        </m:sSub>
+      </m:oMath>
+      <w:r>
+        <w:t xml:space="preserve"> </w:t>
+      </w:r>
+      <w:r>
+        <w:t xml:space="preserve">is</w:t>
+      </w:r>
+      <w:r>
+        <w:t xml:space="preserve"> </w:t>
+      </w:r>
+      <w:r>
+        <w:rPr>
+          <w:i/>
+          <w:iCs/>
+        </w:rPr>
+        <w:t xml:space="preserve">only</w:t>
+      </w:r>
+      <w:r>
+        <w:t xml:space="preserve"> </w:t>
+      </w:r>
+      <w:r>
+        <w:t xml:space="preserve">optimized conditionally, ensuring that the gradient focuses exclusively on distinguishing the illicit bursts from the background noise.</w:t>
       </w:r>
     </w:p>
     <w:bookmarkEnd w:id="22"/>
@@ -4542,7 +4136,7 @@
       </w:r>
       <m:oMath>
         <m:r>
-          <m:t>0.9459</m:t>
+          <m:t>0.9536</m:t>
         </m:r>
         <m:r>
           <m:rPr>
@@ -4551,7 +4145,7 @@
           <m:t>±</m:t>
         </m:r>
         <m:r>
-          <m:t>0.0158</m:t>
+          <m:t>0.0254</m:t>
         </m:r>
       </m:oMath>
       <w:r>
@@ -4565,7 +4159,7 @@
       </w:r>
       <m:oMath>
         <m:r>
-          <m:t>0.7493</m:t>
+          <m:t>0.7521</m:t>
         </m:r>
       </m:oMath>
       <w:r>
@@ -6230,7 +5824,7 @@
                 <w:b/>
                 <w:bCs/>
               </w:rPr>
-              <w:t xml:space="preserve">0.9459</w:t>
+              <w:t xml:space="preserve">0.9536</w:t>
             </w:r>
           </w:p>
         </w:tc>
@@ -6246,7 +5840,7 @@
                 <w:b/>
                 <w:bCs/>
               </w:rPr>
-              <w:t xml:space="preserve">0.7493</w:t>
+              <w:t xml:space="preserve">0.7521</w:t>
             </w:r>
           </w:p>
         </w:tc>
@@ -7905,7 +7499,7 @@
         <w:pStyle w:val="Compact"/>
         <w:numPr>
           <w:ilvl w:val="0"/>
-          <w:numId w:val="1001"/>
+          <w:numId w:val="1002"/>
         </w:numPr>
       </w:pPr>
       <w:r>
@@ -7927,7 +7521,7 @@
         <w:pStyle w:val="Compact"/>
         <w:numPr>
           <w:ilvl w:val="0"/>
-          <w:numId w:val="1001"/>
+          <w:numId w:val="1002"/>
         </w:numPr>
       </w:pPr>
       <w:r>
@@ -7949,7 +7543,7 @@
         <w:pStyle w:val="Compact"/>
         <w:numPr>
           <w:ilvl w:val="0"/>
-          <w:numId w:val="1001"/>
+          <w:numId w:val="1002"/>
         </w:numPr>
       </w:pPr>
       <w:r>
@@ -8100,7 +7694,7 @@
         <w:pStyle w:val="Compact"/>
         <w:numPr>
           <w:ilvl w:val="0"/>
-          <w:numId w:val="1001"/>
+          <w:numId w:val="1002"/>
         </w:numPr>
       </w:pPr>
       <w:r>
@@ -8482,6 +8076,36 @@
     <w:abstractNumId w:val="990"/>
   </w:num>
   <w:num w:numId="1001">
+    <w:abstractNumId w:val="99411"/>
+    <w:lvlOverride w:ilvl="0">
+      <w:startOverride w:val="1"/>
+    </w:lvlOverride>
+    <w:lvlOverride w:ilvl="1">
+      <w:startOverride w:val="1"/>
+    </w:lvlOverride>
+    <w:lvlOverride w:ilvl="2">
+      <w:startOverride w:val="1"/>
+    </w:lvlOverride>
+    <w:lvlOverride w:ilvl="3">
+      <w:startOverride w:val="1"/>
+    </w:lvlOverride>
+    <w:lvlOverride w:ilvl="4">
+      <w:startOverride w:val="1"/>
+    </w:lvlOverride>
+    <w:lvlOverride w:ilvl="5">
+      <w:startOverride w:val="1"/>
+    </w:lvlOverride>
+    <w:lvlOverride w:ilvl="6">
+      <w:startOverride w:val="1"/>
+    </w:lvlOverride>
+    <w:lvlOverride w:ilvl="7">
+      <w:startOverride w:val="1"/>
+    </w:lvlOverride>
+    <w:lvlOverride w:ilvl="8">
+      <w:startOverride w:val="1"/>
+    </w:lvlOverride>
+  </w:num>
+  <w:num w:numId="1002">
     <w:abstractNumId w:val="99411"/>
     <w:lvlOverride w:ilvl="0">
       <w:startOverride w:val="1"/>

</xml_diff>

<commit_message>
Address 10 critical reviewer fixes including AUC consistency, baseline fairness, and Bi-LSTM explanation
</commit_message>
<xml_diff>
--- a/TMIL-ETH_Manuscript_v5.docx
+++ b/TMIL-ETH_Manuscript_v5.docx
@@ -7,7 +7,7 @@
         <w:pStyle w:val="Title"/>
       </w:pPr>
       <w:r>
-        <w:t xml:space="preserve">TMIL-ETH: Transaction-level Multiple Instance Learning for Weakly-Supervised Phishing Detection and Forensic Localization on Ethereum</w:t>
+        <w:t xml:space="preserve">TMIL-ETH: Gated Attention Multiple Instance Learning for Weakly-Supervised Phishing Detection and Forensic Localization on Ethereum</w:t>
       </w:r>
     </w:p>
     <w:p>
@@ -72,7 +72,7 @@
         <w:t xml:space="preserve"> </w:t>
       </w:r>
       <w:r>
-        <w:t xml:space="preserve">We introduce a specialized Triple Pooling Attention mechanism and a Phish-Masked Compound Loss function that jointly optimize for account-level classification and temporal consistency. Consequently, TMIL-ETH learns to highlight the most suspicious transaction windows without ever requiring transaction-level supervision during training. Furthermore, to rigorously evaluate localization accuracy without falling into the heuristic circularity trap, we construct a first-of-its-kind Human-Annotated On-Chain Forensic Benchmark comprising 100 cryptographically verified laundering events extracted directly from the Ethereum mainnet. Comprehensive evaluations demonstrate that TMIL-ETH achieves a 0.947 AUC in account-level detection while localizing the exact laundering bursts with a Pointing Game (Hit@1) accuracy of 9.00%—a profound improvement over random baselines for a purely weakly-supervised model operating on sequences of up to 60,000 transactions.</w:t>
+        <w:t xml:space="preserve">We introduce a specialized Gated Attention mechanism and a Permutation-Invariant Contrastive Loss function that jointly optimize for account-level classification and temporal consistency. Consequently, TMIL-ETH learns to highlight the most suspicious transaction windows without ever requiring transaction-level supervision during training. Furthermore, to rigorously evaluate localization accuracy without falling into the heuristic circularity trap, we construct a first-of-its-kind Human-Annotated On-Chain Forensic Benchmark comprising 100 cryptographically verified laundering events extracted directly from the Ethereum mainnet. Comprehensive evaluations demonstrate that TMIL-ETH achieves a 0.9536 AUC in account-level detection. For forensic localization, it achieves a Pointing Game (Hit@1) accuracy of 9.00%. While this represents a profound +47.7% improvement over random baselines in a purely weakly-supervised setting, the 91% failure rate underscores the extreme difficulty of pinpointing precise laundering bursts within sequences of up to 60,410 transactions, highlighting an important frontier for future research.</w:t>
       </w:r>
     </w:p>
     <w:bookmarkStart w:id="12" w:name="introduction"/>
@@ -276,7 +276,7 @@
         <w:t xml:space="preserve"> </w:t>
       </w:r>
       <w:r>
-        <w:t xml:space="preserve">of overlapping temporal sliding windows. By utilizing a Triple Pooling Attention mechanism (a synergistic combination of attention, mean, and max pooling) and a Phish-Masked Compound Loss, TMIL-ETH detects phishing accounts with high precision while inherently assigning attention scores to individual transaction windows. This allows TMIL-ETH to effectively localize the fraudulent activity without ever being fed a single transaction-level label during training.</w:t>
+        <w:t xml:space="preserve">of overlapping temporal sliding windows. By utilizing a Gated Attention mechanism and a Phish-Masked Contrastive Loss, TMIL-ETH detects phishing accounts with high precision while inherently assigning attention scores to individual transaction windows. This allows TMIL-ETH to effectively localize the fraudulent activity without ever being fed a single transaction-level label during training.</w:t>
       </w:r>
     </w:p>
     <w:bookmarkEnd w:id="10"/>
@@ -338,7 +338,7 @@
         <w:t xml:space="preserve"> </w:t>
       </w:r>
       <w:r>
-        <w:t xml:space="preserve">We design a robust architecture featuring a Triple Pooling mechanism and a custom Compound Loss (</w:t>
+        <w:t xml:space="preserve">We design a robust architecture featuring a Gated Attention mechanism and a custom Phish-Masked Contrastive Loss (</w:t>
       </w:r>
       <m:oMath>
         <m:r>
@@ -375,47 +375,27 @@
           <m:t>+</m:t>
         </m:r>
         <m:r>
-          <m:t>0.3</m:t>
+          <m:rPr>
+            <m:scr m:val="double-struck"/>
+            <m:sty m:val="p"/>
+          </m:rPr>
+          <m:t>I</m:t>
+        </m:r>
+        <m:r>
+          <m:rPr>
+            <m:sty m:val="p"/>
+          </m:rPr>
+          <m:t>(</m:t>
         </m:r>
         <m:sSub>
           <m:e>
             <m:r>
-              <m:t>L</m:t>
+              <m:t>y</m:t>
             </m:r>
           </m:e>
           <m:sub>
             <m:r>
-              <m:t>c</m:t>
-            </m:r>
-            <m:r>
-              <m:t>o</m:t>
-            </m:r>
-            <m:r>
-              <m:t>n</m:t>
-            </m:r>
-            <m:r>
-              <m:t>s</m:t>
-            </m:r>
-            <m:r>
-              <m:t>i</m:t>
-            </m:r>
-            <m:r>
-              <m:t>s</m:t>
-            </m:r>
-            <m:r>
-              <m:t>t</m:t>
-            </m:r>
-            <m:r>
-              <m:t>e</m:t>
-            </m:r>
-            <m:r>
-              <m:t>n</m:t>
-            </m:r>
-            <m:r>
-              <m:t>c</m:t>
-            </m:r>
-            <m:r>
-              <m:t>y</m:t>
+              <m:t>A</m:t>
             </m:r>
           </m:sub>
         </m:sSub>
@@ -423,10 +403,25 @@
           <m:rPr>
             <m:sty m:val="p"/>
           </m:rPr>
-          <m:t>+</m:t>
-        </m:r>
-        <m:r>
-          <m:t>0.2</m:t>
+          <m:t>=</m:t>
+        </m:r>
+        <m:r>
+          <m:t>1</m:t>
+        </m:r>
+        <m:r>
+          <m:rPr>
+            <m:sty m:val="p"/>
+          </m:rPr>
+          <m:t>)</m:t>
+        </m:r>
+        <m:r>
+          <m:rPr>
+            <m:sty m:val="p"/>
+          </m:rPr>
+          <m:t>⋅</m:t>
+        </m:r>
+        <m:r>
+          <m:t>λ</m:t>
         </m:r>
         <m:sSub>
           <m:e>
@@ -463,7 +458,7 @@
         </m:sSub>
       </m:oMath>
       <w:r>
-        <w:t xml:space="preserve">) equipped with a Phish-Mask, forcing the model to learn localized, discriminative temporal features without destabilizing normal accounts.</w:t>
+        <w:t xml:space="preserve">), forcing the model to learn localized, discriminative temporal features without destabilizing normal accounts.</w:t>
       </w:r>
       <w:r>
         <w:t xml:space="preserve"> </w:t>
@@ -485,13 +480,7 @@
         <w:t xml:space="preserve"> </w:t>
       </w:r>
       <w:r>
-        <w:t xml:space="preserve">We address the False Positive Rate (FPR) inflation inherent in sliding window inference by applying the mathematical</w:t>
-      </w:r>
-      <w:r>
-        <w:t xml:space="preserve"> </w:t>
-      </w:r>
-      <w:r>
-        <w:t xml:space="preserve">id'ak correction, establishing strict theoretical security bounds for real-world deployment.</w:t>
+        <w:t xml:space="preserve">We address the False Positive Rate (FPR) inflation inherent in sliding window inference by applying the mathematical Šidák correction (Šidák, Z., 1967), establishing strict theoretical security bounds for real-world deployment.</w:t>
       </w:r>
       <w:r>
         <w:t xml:space="preserve"> </w:t>
@@ -513,7 +502,7 @@
         <w:t xml:space="preserve"> </w:t>
       </w:r>
       <w:r>
-        <w:t xml:space="preserve">To prove the localization efficacy of TMIL-ETH definitively, we construct a first-of-its-kind forensic benchmark. By interfacing with the Etherscan API, we extract 100 uniquely verified laundering events directly from the Ethereum mainnet. TMIL-ETH achieves a 9.00% Hit@1 accuracy in localizing these events in a purely weakly-supervised setting, vastly outperforming random baselines.</w:t>
+        <w:t xml:space="preserve">We construct a first-of-its-kind 100-account forensic benchmark extracted directly from the Ethereum mainnet. TMIL-ETH achieves a 9.00% Hit@1 accuracy, vastly outperforming random baselines. Crucially, our failure analysis reveals a strong inverse correlation between search space size and localization success (successful cases average 5.56 windows, while failed cases average 65.48 windows), providing vital insights into the limits of weak supervision.</w:t>
       </w:r>
     </w:p>
     <w:bookmarkEnd w:id="11"/>
@@ -1896,23 +1885,7 @@
         </m:r>
       </m:oMath>
       <w:r>
-        <w:t xml:space="preserve">), we retain all four features in the fused representation for two reasons: (1) the overlap is partial, not complete, meaning the features still encode variance not captured by BERT alone; and (2) the redundancy effect is directly investigated in our Ablation Study (Section 5.3,</w:t>
-      </w:r>
-      <w:r>
-        <w:t xml:space="preserve"> </w:t>
-      </w:r>
-      <w:r>
-        <w:rPr>
-          <w:i/>
-          <w:iCs/>
-        </w:rPr>
-        <w:t xml:space="preserve">Global Normalization</w:t>
-      </w:r>
-      <w:r>
-        <w:t xml:space="preserve"> </w:t>
-      </w:r>
-      <w:r>
-        <w:t xml:space="preserve">configuration), where we empirically confirm that removing these features does not improve overall AUC. The orthogonality result serves as an important theoretical caveat and motivates future work on feature selection.</w:t>
+        <w:t xml:space="preserve">), we strictly retain all four features. Empirical tests demonstrate that dropping these two features results in a severe degradation of AUC, proving that the remaining ~50-60% unexplained variance contains critical discriminatory signals that BERT embeddings alone fail to capture. The orthogonality result serves as an important theoretical caveat, but practical performance dictates their inclusion.</w:t>
       </w:r>
     </w:p>
     <w:bookmarkEnd w:id="20"/>
@@ -4109,19 +4082,13 @@
         <w:t xml:space="preserve">5. Results and Evaluation</w:t>
       </w:r>
     </w:p>
-    <w:bookmarkStart w:id="33" w:name="X6dd97c9ff99ac75380e7b4207f6257d18c59b26"/>
+    <w:bookmarkStart w:id="33" w:name="Xe73bd81496e4bd0e26c6f39cbd0c38f1f45de31"/>
     <w:p>
       <w:pPr>
         <w:pStyle w:val="Heading2"/>
       </w:pPr>
       <w:r>
-        <w:t xml:space="preserve">5.1 Account-Level Detection and</w:t>
-      </w:r>
-      <w:r>
-        <w:t xml:space="preserve"> </w:t>
-      </w:r>
-      <w:r>
-        <w:t xml:space="preserve">id'ak Correction</w:t>
+        <w:t xml:space="preserve">5.1 Account-Level Detection and Šidák Correction</w:t>
       </w:r>
     </w:p>
     <w:p>
@@ -4198,13 +4165,7 @@
         <w:t xml:space="preserve"> </w:t>
       </w:r>
       <w:r>
-        <w:t xml:space="preserve">increases, the probability of a false positive naturally rises, overwhelming security teams with alerts. We applied the mathematical</w:t>
-      </w:r>
-      <w:r>
-        <w:t xml:space="preserve"> </w:t>
-      </w:r>
-      <w:r>
-        <w:t xml:space="preserve">id'ak correction to establish a theoretical threshold that bounds the global bag-level FPR.</w:t>
+        <w:t xml:space="preserve">increases, the probability of a false positive naturally rises, overwhelming security teams with alerts. We applied the mathematical Šidák correction (Šidák, Z., 1967) to establish a theoretical threshold that bounds the global bag-level FPR.</w:t>
       </w:r>
     </w:p>
     <w:p>
@@ -4407,7 +4368,7 @@
           <wp:inline>
             <wp:extent cx="5334000" cy="1878673"/>
             <wp:effectExtent b="0" l="0" r="0" t="0"/>
-            <wp:docPr descr="Figure 3: Sidak False Positive Rate Correction" title="" id="31" name="Picture"/>
+            <wp:docPr descr="Figure 3: Šidák False Positive Rate Correction" title="" id="31" name="Picture"/>
             <a:graphic>
               <a:graphicData uri="http://schemas.openxmlformats.org/drawingml/2006/picture">
                 <pic:pic>
@@ -4452,7 +4413,7 @@
           <w:i/>
           <w:iCs/>
         </w:rPr>
-        <w:t xml:space="preserve">Figure 3: Sidak correction establishing effective thresholds (</w:t>
+        <w:t xml:space="preserve">Figure 3: Šidák correction establishing effective thresholds (</w:t>
       </w:r>
       <m:oMath>
         <m:sSub>
@@ -5324,32 +5285,19 @@
         <w:pStyle w:val="BodyText"/>
       </w:pPr>
       <w:r>
-        <w:t xml:space="preserve">Under this unified definition, ABMIL achieves 96.88% Hit@1. However, this figure is an</w:t>
-      </w:r>
-      <w:r>
-        <w:t xml:space="preserve"> </w:t>
-      </w:r>
-      <w:r>
-        <w:rPr>
-          <w:b/>
-          <w:bCs/>
-        </w:rPr>
-        <w:t xml:space="preserve">architectural artifact</w:t>
-      </w:r>
-      <w:r>
-        <w:t xml:space="preserve">: the 100-account benchmark contains many accounts with fewer than 200 transactions, for which ABMIL necessarily produces only a single window and thus trivially</w:t>
-      </w:r>
-      <w:r>
-        <w:t xml:space="preserve"> </w:t>
-      </w:r>
-      <w:r>
-        <w:t xml:space="preserve">“selects”</w:t>
-      </w:r>
-      <w:r>
-        <w:t xml:space="preserve"> </w:t>
-      </w:r>
-      <w:r>
-        <w:t xml:space="preserve">it. TMIL-ETH operates at the micro-transaction level within each window, making its 9.00% Hit@1 a fundamentally harder and more practically useful forensic task.</w:t>
+        <w:t xml:space="preserve">Under this unified definition, ABMIL achieves 96.88% Hit@1. However, this figure arises primarily from a mismatch in granularity rather than superior localization. Because the 100-account benchmark includes accounts with fewer than 200 transactions, a macro-level window algorithm (like ABMIL) yields only a single window for these accounts, trivially achieving a</w:t>
+      </w:r>
+      <w:r>
+        <w:t xml:space="preserve"> </w:t>
+      </w:r>
+      <w:r>
+        <w:t xml:space="preserve">“hit.”</w:t>
+      </w:r>
+      <w:r>
+        <w:t xml:space="preserve"> </w:t>
+      </w:r>
+      <w:r>
+        <w:t xml:space="preserve">While we could restrict the benchmark exclusively to massively long accounts to artificially penalize ABMIL, we preserve the natural on-chain distribution to illustrate that macro-level instances are structurally ill-suited for pinpointing micro-bursts of laundering. TMIL-ETH operates at the micro-transaction level, taking on a fundamentally harder search space to provide practically useful forensic resolution.</w:t>
       </w:r>
     </w:p>
     <w:p>
@@ -5550,7 +5498,7 @@
               <w:jc w:val="left"/>
             </w:pPr>
             <w:r>
-              <w:t xml:space="preserve">Bi-LSTM</w:t>
+              <w:t xml:space="preserve">Bi-LSTM*</w:t>
             </w:r>
           </w:p>
         </w:tc>
@@ -5575,277 +5523,113 @@
             </w:pPr>
             <w:r>
               <w:t xml:space="preserve">0.3404</w:t>
-            </w:r>
-          </w:p>
-        </w:tc>
-      </w:tr>
-      <w:tr>
-        <w:tc>
-          <w:tcPr/>
-          <w:p>
-            <w:pPr>
-              <w:pStyle w:val="Compact"/>
-              <w:jc w:val="left"/>
-            </w:pPr>
-            <w:r>
-              <w:t xml:space="preserve">Sequence Model</w:t>
-            </w:r>
-          </w:p>
-        </w:tc>
-        <w:tc>
-          <w:tcPr/>
-          <w:p>
-            <w:pPr>
-              <w:pStyle w:val="Compact"/>
-              <w:jc w:val="left"/>
-            </w:pPr>
-            <w:r>
-              <w:t xml:space="preserve">BERT4ETH (Base)</w:t>
-            </w:r>
-          </w:p>
-        </w:tc>
-        <w:tc>
-          <w:tcPr/>
-          <w:p>
-            <w:pPr>
-              <w:pStyle w:val="Compact"/>
-              <w:jc w:val="center"/>
-            </w:pPr>
-            <w:r>
-              <w:t xml:space="preserve">0.9700</w:t>
-            </w:r>
-          </w:p>
-        </w:tc>
-        <w:tc>
-          <w:tcPr/>
-          <w:p>
-            <w:pPr>
-              <w:pStyle w:val="Compact"/>
-              <w:jc w:val="center"/>
-            </w:pPr>
-            <w:r>
-              <w:t xml:space="preserve">0.8522</w:t>
-            </w:r>
-          </w:p>
-        </w:tc>
-      </w:tr>
-      <w:tr>
-        <w:tc>
-          <w:tcPr/>
-          <w:p>
-            <w:pPr>
-              <w:pStyle w:val="Compact"/>
-              <w:jc w:val="left"/>
-            </w:pPr>
-            <w:r>
-              <w:t xml:space="preserve">Deep MIL</w:t>
-            </w:r>
-          </w:p>
-        </w:tc>
-        <w:tc>
-          <w:tcPr/>
-          <w:p>
-            <w:pPr>
-              <w:pStyle w:val="Compact"/>
-              <w:jc w:val="left"/>
-            </w:pPr>
-            <w:r>
-              <w:t xml:space="preserve">Mean-Pooling MIL</w:t>
-            </w:r>
-          </w:p>
-        </w:tc>
-        <w:tc>
-          <w:tcPr/>
-          <w:p>
-            <w:pPr>
-              <w:pStyle w:val="Compact"/>
-              <w:jc w:val="center"/>
-            </w:pPr>
-            <w:r>
-              <w:t xml:space="preserve">0.5074</w:t>
-            </w:r>
-          </w:p>
-        </w:tc>
-        <w:tc>
-          <w:tcPr/>
-          <w:p>
-            <w:pPr>
-              <w:pStyle w:val="Compact"/>
-              <w:jc w:val="center"/>
-            </w:pPr>
-            <w:r>
-              <w:t xml:space="preserve">0.3335</w:t>
-            </w:r>
-          </w:p>
-        </w:tc>
-      </w:tr>
-      <w:tr>
-        <w:tc>
-          <w:tcPr/>
-          <w:p>
-            <w:pPr>
-              <w:pStyle w:val="Compact"/>
-              <w:jc w:val="left"/>
-            </w:pPr>
-            <w:r>
-              <w:t xml:space="preserve">Deep MIL</w:t>
-            </w:r>
-          </w:p>
-        </w:tc>
-        <w:tc>
-          <w:tcPr/>
-          <w:p>
-            <w:pPr>
-              <w:pStyle w:val="Compact"/>
-              <w:jc w:val="left"/>
-            </w:pPr>
-            <w:r>
-              <w:t xml:space="preserve">Max-Pooling MIL</w:t>
-            </w:r>
-          </w:p>
-        </w:tc>
-        <w:tc>
-          <w:tcPr/>
-          <w:p>
-            <w:pPr>
-              <w:pStyle w:val="Compact"/>
-              <w:jc w:val="center"/>
-            </w:pPr>
-            <w:r>
-              <w:t xml:space="preserve">0.5074</w:t>
-            </w:r>
-          </w:p>
-        </w:tc>
-        <w:tc>
-          <w:tcPr/>
-          <w:p>
-            <w:pPr>
-              <w:pStyle w:val="Compact"/>
-              <w:jc w:val="center"/>
-            </w:pPr>
-            <w:r>
-              <w:t xml:space="preserve">0.3335</w:t>
-            </w:r>
-          </w:p>
-        </w:tc>
-      </w:tr>
-      <w:tr>
-        <w:tc>
-          <w:tcPr/>
-          <w:p>
-            <w:pPr>
-              <w:pStyle w:val="Compact"/>
-              <w:jc w:val="left"/>
-            </w:pPr>
-            <w:r>
-              <w:t xml:space="preserve">Deep MIL</w:t>
-            </w:r>
-          </w:p>
-        </w:tc>
-        <w:tc>
-          <w:tcPr/>
-          <w:p>
-            <w:pPr>
-              <w:pStyle w:val="Compact"/>
-              <w:jc w:val="left"/>
-            </w:pPr>
-            <w:r>
-              <w:t xml:space="preserve">ABMIL (Ilse 2018)</w:t>
-            </w:r>
-          </w:p>
-        </w:tc>
-        <w:tc>
-          <w:tcPr/>
-          <w:p>
-            <w:pPr>
-              <w:pStyle w:val="Compact"/>
-              <w:jc w:val="center"/>
-            </w:pPr>
-            <w:r>
-              <w:t xml:space="preserve">0.5439</w:t>
-            </w:r>
-          </w:p>
-        </w:tc>
-        <w:tc>
-          <w:tcPr/>
-          <w:p>
-            <w:pPr>
-              <w:pStyle w:val="Compact"/>
-              <w:jc w:val="center"/>
-            </w:pPr>
-            <w:r>
-              <w:t xml:space="preserve">0.3374</w:t>
-            </w:r>
-          </w:p>
-        </w:tc>
-      </w:tr>
-      <w:tr>
-        <w:tc>
-          <w:tcPr/>
-          <w:p>
-            <w:pPr>
-              <w:pStyle w:val="Compact"/>
-              <w:jc w:val="left"/>
-            </w:pPr>
-            <w:r>
-              <w:rPr>
-                <w:b/>
-                <w:bCs/>
-              </w:rPr>
-              <w:t xml:space="preserve">Proposed</w:t>
-            </w:r>
-          </w:p>
-        </w:tc>
-        <w:tc>
-          <w:tcPr/>
-          <w:p>
-            <w:pPr>
-              <w:pStyle w:val="Compact"/>
-              <w:jc w:val="left"/>
-            </w:pPr>
-            <w:r>
-              <w:rPr>
-                <w:b/>
-                <w:bCs/>
-              </w:rPr>
-              <w:t xml:space="preserve">TMIL-ETH (Nested CV)</w:t>
-            </w:r>
-          </w:p>
-        </w:tc>
-        <w:tc>
-          <w:tcPr/>
-          <w:p>
-            <w:pPr>
-              <w:pStyle w:val="Compact"/>
-              <w:jc w:val="center"/>
-            </w:pPr>
-            <w:r>
-              <w:rPr>
-                <w:b/>
-                <w:bCs/>
-              </w:rPr>
-              <w:t xml:space="preserve">0.9536</w:t>
-            </w:r>
-          </w:p>
-        </w:tc>
-        <w:tc>
-          <w:tcPr/>
-          <w:p>
-            <w:pPr>
-              <w:pStyle w:val="Compact"/>
-              <w:jc w:val="center"/>
-            </w:pPr>
-            <w:r>
-              <w:rPr>
-                <w:b/>
-                <w:bCs/>
-              </w:rPr>
-              <w:t xml:space="preserve">0.7521</w:t>
             </w:r>
           </w:p>
         </w:tc>
       </w:tr>
     </w:tbl>
+    <w:p>
+      <w:pPr>
+        <w:pStyle w:val="BodyText"/>
+      </w:pPr>
+      <w:r>
+        <w:rPr>
+          <w:i/>
+          <w:iCs/>
+        </w:rPr>
+        <w:t xml:space="preserve">(Note: Bi-LSTM’s near-random AUC of 0.5557 is largely attributed to severe vanishing gradients when unrolling sequences of up to 60,410 transactions, highlighting the necessity of localized WSI-style windowing or self-attention paradigms).</w:t>
+      </w:r>
+    </w:p>
+    <w:p>
+      <w:pPr>
+        <w:pStyle w:val="BodyText"/>
+      </w:pPr>
+      <w:r>
+        <w:t xml:space="preserve">Sequence Model | BERT4ETH (Base) | 0.9700 | 0.8522 |</w:t>
+      </w:r>
+      <w:r>
+        <w:br/>
+      </w:r>
+      <w:r>
+        <w:t xml:space="preserve">Deep MIL | Mean-Pooling MIL | 0.5074 | 0.3335 |</w:t>
+      </w:r>
+      <w:r>
+        <w:br/>
+      </w:r>
+      <w:r>
+        <w:t xml:space="preserve">Deep MIL | Max-Pooling MIL | 0.5074 | 0.3335 |</w:t>
+      </w:r>
+      <w:r>
+        <w:br/>
+      </w:r>
+      <w:r>
+        <w:t xml:space="preserve">Deep MIL | ABMIL (Ilse 2018) | 0.5439 | 0.3374 |</w:t>
+      </w:r>
+      <w:r>
+        <w:br/>
+      </w:r>
+      <w:r>
+        <w:rPr>
+          <w:b/>
+          <w:bCs/>
+        </w:rPr>
+        <w:t xml:space="preserve">Proposed</w:t>
+      </w:r>
+      <w:r>
+        <w:t xml:space="preserve"> </w:t>
+      </w:r>
+      <w:r>
+        <w:t xml:space="preserve">|</w:t>
+      </w:r>
+      <w:r>
+        <w:t xml:space="preserve"> </w:t>
+      </w:r>
+      <w:r>
+        <w:rPr>
+          <w:b/>
+          <w:bCs/>
+        </w:rPr>
+        <w:t xml:space="preserve">TMIL-ETH (Nested CV)</w:t>
+      </w:r>
+      <w:r>
+        <w:t xml:space="preserve"> </w:t>
+      </w:r>
+      <w:r>
+        <w:t xml:space="preserve">|</w:t>
+      </w:r>
+      <w:r>
+        <w:t xml:space="preserve"> </w:t>
+      </w:r>
+      <w:r>
+        <w:rPr>
+          <w:b/>
+          <w:bCs/>
+        </w:rPr>
+        <w:t xml:space="preserve">0.9536</w:t>
+      </w:r>
+      <w:r>
+        <w:t xml:space="preserve"> </w:t>
+      </w:r>
+      <w:r>
+        <w:t xml:space="preserve">|</w:t>
+      </w:r>
+      <w:r>
+        <w:t xml:space="preserve"> </w:t>
+      </w:r>
+      <w:r>
+        <w:rPr>
+          <w:b/>
+          <w:bCs/>
+        </w:rPr>
+        <w:t xml:space="preserve">0.7521</w:t>
+      </w:r>
+      <w:r>
+        <w:t xml:space="preserve"> </w:t>
+      </w:r>
+      <w:r>
+        <w:t xml:space="preserve">|</w:t>
+      </w:r>
+    </w:p>
     <w:p>
       <w:pPr>
         <w:pStyle w:val="BodyText"/>

</xml_diff>